<commit_message>
Going to do terms and privacy
</commit_message>
<xml_diff>
--- a/Task 2/Asset Log.docx
+++ b/Task 2/Asset Log.docx
@@ -197,19 +197,7 @@
                 <w:rPr>
                   <w:rStyle w:val="Hyperlink"/>
                 </w:rPr>
-                <w:t>https://unsplash.com/photos/two-loaves-of-bread-sitting-on-top-of-a-wooden-table</w:t>
-              </w:r>
-              <w:r>
-                <w:rPr>
-                  <w:rStyle w:val="Hyperlink"/>
-                </w:rPr>
-                <w:t>-</w:t>
-              </w:r>
-              <w:r>
-                <w:rPr>
-                  <w:rStyle w:val="Hyperlink"/>
-                </w:rPr>
-                <w:t>iCUEWaBjtG8</w:t>
+                <w:t>https://unsplash.com/photos/two-loaves-of-bread-sitting-on-top-of-a-wooden-table-iCUEWaBjtG8</w:t>
               </w:r>
             </w:hyperlink>
           </w:p>
@@ -262,19 +250,7 @@
                 <w:rPr>
                   <w:rStyle w:val="Hyperlink"/>
                 </w:rPr>
-                <w:t>https://images.pexels.com/photos/4315102/pexels-photo-4315102</w:t>
-              </w:r>
-              <w:r>
-                <w:rPr>
-                  <w:rStyle w:val="Hyperlink"/>
-                </w:rPr>
-                <w:t>.</w:t>
-              </w:r>
-              <w:r>
-                <w:rPr>
-                  <w:rStyle w:val="Hyperlink"/>
-                </w:rPr>
-                <w:t>jpeg</w:t>
+                <w:t>https://images.pexels.com/photos/4315102/pexels-photo-4315102.jpeg</w:t>
               </w:r>
             </w:hyperlink>
           </w:p>
@@ -430,19 +406,7 @@
                 <w:rPr>
                   <w:rStyle w:val="Hyperlink"/>
                 </w:rPr>
-                <w:t>https://images.unsplash.com/photo-1620</w:t>
-              </w:r>
-              <w:r>
-                <w:rPr>
-                  <w:rStyle w:val="Hyperlink"/>
-                </w:rPr>
-                <w:t>0</w:t>
-              </w:r>
-              <w:r>
-                <w:rPr>
-                  <w:rStyle w:val="Hyperlink"/>
-                </w:rPr>
-                <w:t>53835579-c97b606e18f9?q=80&amp;w=1740&amp;auto=format&amp;fit=crop&amp;ixlib=rb-4.1.0&amp;ixid=M3wxMjA3fDB8MHxwaG90by1wYWdlfHx8fGVufDB8fHx8fA%3D%3D</w:t>
+                <w:t>https://images.unsplash.com/photo-1620053835579-c97b606e18f9?q=80&amp;w=1740&amp;auto=format&amp;fit=crop&amp;ixlib=rb-4.1.0&amp;ixid=M3wxMjA3fDB8MHxwaG90by1wYWdlfHx8fGVufDB8fHx8fA%3D%3D</w:t>
               </w:r>
             </w:hyperlink>
           </w:p>
@@ -751,6 +715,246 @@
                   <w:rStyle w:val="Hyperlink"/>
                 </w:rPr>
                 <w:t>https://images.pexels.com/photos/30666803/pexels-photo-30666803.jpeg</w:t>
+              </w:r>
+            </w:hyperlink>
+          </w:p>
+        </w:tc>
+        <w:tc>
+          <w:tcPr>
+            <w:tcW w:w="1366" w:type="dxa"/>
+          </w:tcPr>
+          <w:p>
+            <w:r>
+              <w:t>16/04/2026</w:t>
+            </w:r>
+          </w:p>
+        </w:tc>
+      </w:tr>
+      <w:tr>
+        <w:tc>
+          <w:tcPr>
+            <w:tcW w:w="2830" w:type="dxa"/>
+          </w:tcPr>
+          <w:p>
+            <w:r>
+              <w:t>beefSausages.jpg</w:t>
+            </w:r>
+          </w:p>
+        </w:tc>
+        <w:tc>
+          <w:tcPr>
+            <w:tcW w:w="2552" w:type="dxa"/>
+          </w:tcPr>
+          <w:p>
+            <w:r>
+              <w:t xml:space="preserve">Product image in the shop page </w:t>
+            </w:r>
+          </w:p>
+        </w:tc>
+        <w:tc>
+          <w:tcPr>
+            <w:tcW w:w="2268" w:type="dxa"/>
+          </w:tcPr>
+          <w:p>
+            <w:hyperlink r:id="rId18" w:history="1">
+              <w:r>
+                <w:rPr>
+                  <w:rStyle w:val="Hyperlink"/>
+                </w:rPr>
+                <w:t>https://images.pexels.com/photos/4728270/pexels-photo-4728270.jpeg</w:t>
+              </w:r>
+            </w:hyperlink>
+          </w:p>
+        </w:tc>
+        <w:tc>
+          <w:tcPr>
+            <w:tcW w:w="1366" w:type="dxa"/>
+          </w:tcPr>
+          <w:p>
+            <w:r>
+              <w:t>16/04/2026</w:t>
+            </w:r>
+          </w:p>
+        </w:tc>
+      </w:tr>
+      <w:tr>
+        <w:tc>
+          <w:tcPr>
+            <w:tcW w:w="2830" w:type="dxa"/>
+          </w:tcPr>
+          <w:p>
+            <w:r>
+              <w:t>heirloomPotatoes.jpg</w:t>
+            </w:r>
+          </w:p>
+        </w:tc>
+        <w:tc>
+          <w:tcPr>
+            <w:tcW w:w="2552" w:type="dxa"/>
+          </w:tcPr>
+          <w:p>
+            <w:r>
+              <w:t xml:space="preserve">Product image in the shop page </w:t>
+            </w:r>
+          </w:p>
+        </w:tc>
+        <w:tc>
+          <w:tcPr>
+            <w:tcW w:w="2268" w:type="dxa"/>
+          </w:tcPr>
+          <w:p>
+            <w:hyperlink r:id="rId19" w:history="1">
+              <w:r>
+                <w:rPr>
+                  <w:rStyle w:val="Hyperlink"/>
+                </w:rPr>
+                <w:t>https://images.pexels.com/photos/35522608/pexels-photo-35522608.jpeg</w:t>
+              </w:r>
+            </w:hyperlink>
+          </w:p>
+        </w:tc>
+        <w:tc>
+          <w:tcPr>
+            <w:tcW w:w="1366" w:type="dxa"/>
+          </w:tcPr>
+          <w:p>
+            <w:r>
+              <w:t>16/04/2026</w:t>
+            </w:r>
+          </w:p>
+        </w:tc>
+      </w:tr>
+      <w:tr>
+        <w:tc>
+          <w:tcPr>
+            <w:tcW w:w="2830" w:type="dxa"/>
+          </w:tcPr>
+          <w:p>
+            <w:r>
+              <w:t>rawMilkYogurt.jpg</w:t>
+            </w:r>
+          </w:p>
+        </w:tc>
+        <w:tc>
+          <w:tcPr>
+            <w:tcW w:w="2552" w:type="dxa"/>
+          </w:tcPr>
+          <w:p>
+            <w:r>
+              <w:t xml:space="preserve">Product image in the shop page </w:t>
+            </w:r>
+          </w:p>
+        </w:tc>
+        <w:tc>
+          <w:tcPr>
+            <w:tcW w:w="2268" w:type="dxa"/>
+          </w:tcPr>
+          <w:p>
+            <w:hyperlink r:id="rId20" w:history="1">
+              <w:r>
+                <w:rPr>
+                  <w:rStyle w:val="Hyperlink"/>
+                </w:rPr>
+                <w:t>https://images.pexels.com/photos/373882/pexels-photo-373882.jpeg</w:t>
+              </w:r>
+            </w:hyperlink>
+          </w:p>
+        </w:tc>
+        <w:tc>
+          <w:tcPr>
+            <w:tcW w:w="1366" w:type="dxa"/>
+          </w:tcPr>
+          <w:p>
+            <w:r>
+              <w:t>16/04/2026</w:t>
+            </w:r>
+          </w:p>
+        </w:tc>
+      </w:tr>
+      <w:tr>
+        <w:tc>
+          <w:tcPr>
+            <w:tcW w:w="2830" w:type="dxa"/>
+          </w:tcPr>
+          <w:p>
+            <w:r>
+              <w:t>sourdoughBaguette</w:t>
+            </w:r>
+            <w:r>
+              <w:t>.jpg</w:t>
+            </w:r>
+          </w:p>
+          <w:p/>
+        </w:tc>
+        <w:tc>
+          <w:tcPr>
+            <w:tcW w:w="2552" w:type="dxa"/>
+          </w:tcPr>
+          <w:p>
+            <w:r>
+              <w:t xml:space="preserve">Product image in the shop page </w:t>
+            </w:r>
+          </w:p>
+        </w:tc>
+        <w:tc>
+          <w:tcPr>
+            <w:tcW w:w="2268" w:type="dxa"/>
+          </w:tcPr>
+          <w:p>
+            <w:hyperlink r:id="rId21" w:history="1">
+              <w:r>
+                <w:rPr>
+                  <w:rStyle w:val="Hyperlink"/>
+                </w:rPr>
+                <w:t>https://images.pexels.com/photos/30874231/pexels-photo-30874231.jpeg</w:t>
+              </w:r>
+            </w:hyperlink>
+          </w:p>
+        </w:tc>
+        <w:tc>
+          <w:tcPr>
+            <w:tcW w:w="1366" w:type="dxa"/>
+          </w:tcPr>
+          <w:p>
+            <w:r>
+              <w:t>16/04/2026</w:t>
+            </w:r>
+          </w:p>
+        </w:tc>
+      </w:tr>
+      <w:tr>
+        <w:tc>
+          <w:tcPr>
+            <w:tcW w:w="2830" w:type="dxa"/>
+          </w:tcPr>
+          <w:p>
+            <w:r>
+              <w:t>freeRangeChicken.jpg</w:t>
+            </w:r>
+          </w:p>
+          <w:p/>
+        </w:tc>
+        <w:tc>
+          <w:tcPr>
+            <w:tcW w:w="2552" w:type="dxa"/>
+          </w:tcPr>
+          <w:p>
+            <w:r>
+              <w:t xml:space="preserve">Product image in the shop page </w:t>
+            </w:r>
+          </w:p>
+        </w:tc>
+        <w:tc>
+          <w:tcPr>
+            <w:tcW w:w="2268" w:type="dxa"/>
+          </w:tcPr>
+          <w:p>
+            <w:hyperlink r:id="rId22" w:history="1">
+              <w:r>
+                <w:rPr>
+                  <w:rStyle w:val="Hyperlink"/>
+                </w:rPr>
+                <w:t>https://images.pexels.com/photos/10842249/pexels-photo-10842249.jpeg</w:t>
               </w:r>
             </w:hyperlink>
           </w:p>
@@ -817,7 +1021,7 @@
             <w:tcW w:w="2268" w:type="dxa"/>
           </w:tcPr>
           <w:p>
-            <w:hyperlink r:id="rId18" w:history="1">
+            <w:hyperlink r:id="rId23" w:history="1">
               <w:r>
                 <w:rPr>
                   <w:rStyle w:val="Hyperlink"/>
@@ -867,7 +1071,7 @@
             <w:tcW w:w="2268" w:type="dxa"/>
           </w:tcPr>
           <w:p>
-            <w:hyperlink r:id="rId19" w:history="1">
+            <w:hyperlink r:id="rId24" w:history="1">
               <w:r>
                 <w:rPr>
                   <w:rStyle w:val="Hyperlink"/>
@@ -917,12 +1121,19 @@
             <w:tcW w:w="2268" w:type="dxa"/>
           </w:tcPr>
           <w:p>
-            <w:hyperlink r:id="rId20" w:history="1">
-              <w:r>
-                <w:rPr>
-                  <w:rStyle w:val="Hyperlink"/>
-                </w:rPr>
-                <w:t>https://images.pexels.com/photos/12370134/pexels-photo-12370134.jpeg</w:t>
+            <w:hyperlink r:id="rId25" w:history="1">
+              <w:r>
+                <w:rPr>
+                  <w:rStyle w:val="Hyperlink"/>
+                </w:rPr>
+                <w:t>https://images.pexels.com/photos/1237013</w:t>
+              </w:r>
+              <w:r>
+                <w:rPr>
+                  <w:rStyle w:val="Hyperlink"/>
+                </w:rPr>
+                <w:lastRenderedPageBreak/>
+                <w:t>4/pexels-photo-12370134.jpeg</w:t>
               </w:r>
             </w:hyperlink>
           </w:p>
@@ -933,6 +1144,7 @@
           </w:tcPr>
           <w:p>
             <w:r>
+              <w:lastRenderedPageBreak/>
               <w:t>16/04/2026</w:t>
             </w:r>
           </w:p>
@@ -967,7 +1179,7 @@
             <w:tcW w:w="2268" w:type="dxa"/>
           </w:tcPr>
           <w:p>
-            <w:hyperlink r:id="rId21" w:history="1">
+            <w:hyperlink r:id="rId26" w:history="1">
               <w:r>
                 <w:rPr>
                   <w:rStyle w:val="Hyperlink"/>
@@ -1017,7 +1229,7 @@
             <w:tcW w:w="2268" w:type="dxa"/>
           </w:tcPr>
           <w:p>
-            <w:hyperlink r:id="rId22" w:history="1">
+            <w:hyperlink r:id="rId27" w:history="1">
               <w:r>
                 <w:rPr>
                   <w:rStyle w:val="Hyperlink"/>
@@ -1067,7 +1279,7 @@
             <w:tcW w:w="2268" w:type="dxa"/>
           </w:tcPr>
           <w:p>
-            <w:hyperlink r:id="rId23" w:history="1">
+            <w:hyperlink r:id="rId28" w:history="1">
               <w:r>
                 <w:rPr>
                   <w:rStyle w:val="Hyperlink"/>
@@ -1147,7 +1359,7 @@
             <w:tcW w:w="2268" w:type="dxa"/>
           </w:tcPr>
           <w:p>
-            <w:hyperlink r:id="rId24" w:history="1">
+            <w:hyperlink r:id="rId29" w:history="1">
               <w:r>
                 <w:rPr>
                   <w:rStyle w:val="Hyperlink"/>
@@ -1202,7 +1414,6 @@
           </w:tcPr>
           <w:p>
             <w:r>
-              <w:lastRenderedPageBreak/>
               <w:t>Playfair Display</w:t>
             </w:r>
           </w:p>
@@ -1222,7 +1433,7 @@
             <w:tcW w:w="2268" w:type="dxa"/>
           </w:tcPr>
           <w:p>
-            <w:hyperlink r:id="rId25" w:history="1">
+            <w:hyperlink r:id="rId30" w:history="1">
               <w:r>
                 <w:rPr>
                   <w:rStyle w:val="Hyperlink"/>
@@ -1269,7 +1480,7 @@
             <w:tcW w:w="2268" w:type="dxa"/>
           </w:tcPr>
           <w:p>
-            <w:hyperlink r:id="rId26" w:history="1">
+            <w:hyperlink r:id="rId31" w:history="1">
               <w:r>
                 <w:rPr>
                   <w:rStyle w:val="Hyperlink"/>
@@ -1705,7 +1916,6 @@
   <w:style w:type="character" w:default="1" w:styleId="DefaultParagraphFont">
     <w:name w:val="Default Paragraph Font"/>
     <w:uiPriority w:val="1"/>
-    <w:semiHidden/>
     <w:unhideWhenUsed/>
   </w:style>
   <w:style w:type="table" w:default="1" w:styleId="TableNormal">
@@ -2082,6 +2292,15 @@
 </file>
 
 <file path=customXml/item1.xml><?xml version="1.0" encoding="utf-8"?>
+<?mso-contentType ?>
+<FormTemplates xmlns="http://schemas.microsoft.com/sharepoint/v3/contenttype/forms">
+  <Display>DocumentLibraryForm</Display>
+  <Edit>DocumentLibraryForm</Edit>
+  <New>DocumentLibraryForm</New>
+</FormTemplates>
+</file>
+
+<file path=customXml/item2.xml><?xml version="1.0" encoding="utf-8"?>
 <ct:contentTypeSchema xmlns:ct="http://schemas.microsoft.com/office/2006/metadata/contentType" xmlns:ma="http://schemas.microsoft.com/office/2006/metadata/properties/metaAttributes" ct:_="" ma:_="" ma:contentTypeName="Document" ma:contentTypeID="0x010100EADD39FE071D564795067ADFDB96A36A" ma:contentTypeVersion="12" ma:contentTypeDescription="Create a new document." ma:contentTypeScope="" ma:versionID="601d1b4d945d0c9a55291ad80f61d22b">
   <xsd:schema xmlns:xsd="http://www.w3.org/2001/XMLSchema" xmlns:xs="http://www.w3.org/2001/XMLSchema" xmlns:p="http://schemas.microsoft.com/office/2006/metadata/properties" xmlns:ns3="0399ea55-a39e-4834-8b03-d5f211c695e6" xmlns:ns4="e0aebca0-090b-4af8-98ba-5797179d3e9a" targetNamespace="http://schemas.microsoft.com/office/2006/metadata/properties" ma:root="true" ma:fieldsID="0c887386b52159122614a3b5111147d5" ns3:_="" ns4:_="">
     <xsd:import namespace="0399ea55-a39e-4834-8b03-d5f211c695e6"/>
@@ -2298,15 +2517,6 @@
 </ct:contentTypeSchema>
 </file>
 
-<file path=customXml/item2.xml><?xml version="1.0" encoding="utf-8"?>
-<?mso-contentType ?>
-<FormTemplates xmlns="http://schemas.microsoft.com/sharepoint/v3/contenttype/forms">
-  <Display>DocumentLibraryForm</Display>
-  <Edit>DocumentLibraryForm</Edit>
-  <New>DocumentLibraryForm</New>
-</FormTemplates>
-</file>
-
 <file path=customXml/item3.xml><?xml version="1.0" encoding="utf-8"?>
 <p:properties xmlns:p="http://schemas.microsoft.com/office/2006/metadata/properties" xmlns:xsi="http://www.w3.org/2001/XMLSchema-instance" xmlns:pc="http://schemas.microsoft.com/office/infopath/2007/PartnerControls">
   <documentManagement>
@@ -2316,6 +2526,14 @@
 </file>
 
 <file path=customXml/itemProps1.xml><?xml version="1.0" encoding="utf-8"?>
+<ds:datastoreItem xmlns:ds="http://schemas.openxmlformats.org/officeDocument/2006/customXml" ds:itemID="{3441B2CD-F419-4D65-A176-7B50779636CA}">
+  <ds:schemaRefs>
+    <ds:schemaRef ds:uri="http://schemas.microsoft.com/sharepoint/v3/contenttype/forms"/>
+  </ds:schemaRefs>
+</ds:datastoreItem>
+</file>
+
+<file path=customXml/itemProps2.xml><?xml version="1.0" encoding="utf-8"?>
 <ds:datastoreItem xmlns:ds="http://schemas.openxmlformats.org/officeDocument/2006/customXml" ds:itemID="{0A7DAF46-8D23-4A90-AFCB-8194C757CEAB}">
   <ds:schemaRefs>
     <ds:schemaRef ds:uri="http://schemas.microsoft.com/office/2006/metadata/contentType"/>
@@ -2334,14 +2552,6 @@
 </ds:datastoreItem>
 </file>
 
-<file path=customXml/itemProps2.xml><?xml version="1.0" encoding="utf-8"?>
-<ds:datastoreItem xmlns:ds="http://schemas.openxmlformats.org/officeDocument/2006/customXml" ds:itemID="{3441B2CD-F419-4D65-A176-7B50779636CA}">
-  <ds:schemaRefs>
-    <ds:schemaRef ds:uri="http://schemas.microsoft.com/sharepoint/v3/contenttype/forms"/>
-  </ds:schemaRefs>
-</ds:datastoreItem>
-</file>
-
 <file path=customXml/itemProps3.xml><?xml version="1.0" encoding="utf-8"?>
 <ds:datastoreItem xmlns:ds="http://schemas.openxmlformats.org/officeDocument/2006/customXml" ds:itemID="{AE2A3185-8767-4878-A81A-1057B66FE33B}">
   <ds:schemaRefs>

</xml_diff>